<commit_message>
Turn labels sideways and add borders
</commit_message>
<xml_diff>
--- a/Variants 2026-02.docx
+++ b/Variants 2026-02.docx
@@ -266,6 +266,7 @@
               <w:start w:val="single" w:space="0" w:color="D3D3D3"/>
               <w:end w:val="single" w:space="0" w:color="D3D3D3"/>
             </w:tcBorders>
+            <w:vAlign w:val="center"/>
             <w:tcMar>
               <w:top w:w="25" w:type="dxa"/>
             </w:tcMar>
@@ -275,11 +276,12 @@
             <w:pPr>
               <w:spacing w:before="0" w:after="60"/>
               <w:keepNext/>
-            </w:pPr>
-            <w:r>
-              <w:rPr>
-                <w:rFonts w:ascii="Calibri" w:hAnsi="Calibri"/>
-                <w:sz w:val="20"/>
+              <w:jc w:val="center"/>
+            </w:pPr>
+            <w:r>
+              <w:rPr>
+                <w:rFonts w:ascii="Calibri" w:hAnsi="Calibri"/>
+                <w:sz w:val="18px"/>
               </w:rPr>
               <w:t xml:space="default"/>
             </w:r>
@@ -403,6 +405,7 @@
               <w:start w:val="single" w:space="0" w:color="D3D3D3"/>
               <w:end w:val="single" w:space="0" w:color="D3D3D3"/>
             </w:tcBorders>
+            <w:vAlign w:val="center"/>
             <w:tcMar>
               <w:top w:w="25" w:type="dxa"/>
             </w:tcMar>
@@ -412,11 +415,12 @@
             <w:pPr>
               <w:spacing w:before="0" w:after="60"/>
               <w:keepNext/>
-            </w:pPr>
-            <w:r>
-              <w:rPr>
-                <w:rFonts w:ascii="Calibri" w:hAnsi="Calibri"/>
-                <w:sz w:val="20"/>
+              <w:jc w:val="center"/>
+            </w:pPr>
+            <w:r>
+              <w:rPr>
+                <w:rFonts w:ascii="Calibri" w:hAnsi="Calibri"/>
+                <w:sz w:val="18px"/>
               </w:rPr>
               <w:t xml:space="default">Cognitive Domains</w:t>
             </w:r>
@@ -1056,6 +1060,7 @@
               <w:start w:val="single" w:space="0" w:color="D3D3D3"/>
               <w:end w:val="single" w:space="0" w:color="D3D3D3"/>
             </w:tcBorders>
+            <w:vAlign w:val="center"/>
             <w:tcMar>
               <w:top w:w="25" w:type="dxa"/>
             </w:tcMar>
@@ -1065,11 +1070,12 @@
             <w:pPr>
               <w:spacing w:before="0" w:after="60"/>
               <w:keepNext/>
-            </w:pPr>
-            <w:r>
-              <w:rPr>
-                <w:rFonts w:ascii="Calibri" w:hAnsi="Calibri"/>
-                <w:sz w:val="20"/>
+              <w:jc w:val="center"/>
+            </w:pPr>
+            <w:r>
+              <w:rPr>
+                <w:rFonts w:ascii="Calibri" w:hAnsi="Calibri"/>
+                <w:sz w:val="18px"/>
               </w:rPr>
               <w:t xml:space="default">Motor Domains</w:t>
             </w:r>

</xml_diff>